<commit_message>
added link to the circuitverse file
</commit_message>
<xml_diff>
--- a/Digital Clock Using Logic Gates.docx
+++ b/Digital Clock Using Logic Gates.docx
@@ -526,6 +526,52 @@
         <w:jc w:val="both"/>
         <w:rPr>
           <w:rFonts w:ascii="Times New Roman" w:hAnsi="Times New Roman" w:cs="Times New Roman"/>
+          <w:sz w:val="28"/>
+          <w:szCs w:val="28"/>
+        </w:rPr>
+      </w:pPr>
+      <w:r>
+        <w:rPr>
+          <w:rFonts w:ascii="Times New Roman" w:hAnsi="Times New Roman" w:cs="Times New Roman"/>
+          <w:sz w:val="28"/>
+          <w:szCs w:val="28"/>
+        </w:rPr>
+        <w:t xml:space="preserve">Link to current project: </w:t>
+      </w:r>
+    </w:p>
+    <w:p>
+      <w:pPr>
+        <w:jc w:val="both"/>
+        <w:rPr>
+          <w:rFonts w:ascii="Times New Roman" w:hAnsi="Times New Roman" w:cs="Times New Roman"/>
+          <w:sz w:val="28"/>
+          <w:szCs w:val="28"/>
+        </w:rPr>
+      </w:pPr>
+      <w:hyperlink r:id="rId5" w:history="1">
+        <w:r>
+          <w:rPr>
+            <w:rStyle w:val="Hyperlink"/>
+          </w:rPr>
+          <w:t>https://circuitverse.org/users/417330/projects/digital-clock-d-flip-flop</w:t>
+        </w:r>
+      </w:hyperlink>
+    </w:p>
+    <w:p>
+      <w:pPr>
+        <w:jc w:val="both"/>
+        <w:rPr>
+          <w:rFonts w:ascii="Times New Roman" w:hAnsi="Times New Roman" w:cs="Times New Roman"/>
+          <w:sz w:val="28"/>
+          <w:szCs w:val="28"/>
+        </w:rPr>
+      </w:pPr>
+    </w:p>
+    <w:p>
+      <w:pPr>
+        <w:jc w:val="both"/>
+        <w:rPr>
+          <w:rFonts w:ascii="Times New Roman" w:hAnsi="Times New Roman" w:cs="Times New Roman"/>
           <w:b/>
           <w:bCs/>
           <w:sz w:val="28"/>
@@ -644,6 +690,7 @@
           <w:sz w:val="28"/>
           <w:szCs w:val="28"/>
         </w:rPr>
+        <w:lastRenderedPageBreak/>
         <w:t xml:space="preserve">Display Logic: </w:t>
       </w:r>
     </w:p>
@@ -662,16 +709,7 @@
           <w:sz w:val="28"/>
           <w:szCs w:val="28"/>
         </w:rPr>
-        <w:t xml:space="preserve">To display time as output we need to convert counted binary digits into decimal number for which I used BCD decoder which converts binary coded decimal values back to decimal. I tried to design BCD decoder using Verilog program but </w:t>
-      </w:r>
-      <w:r>
-        <w:rPr>
-          <w:rFonts w:ascii="Times New Roman" w:hAnsi="Times New Roman" w:cs="Times New Roman"/>
-          <w:sz w:val="28"/>
-          <w:szCs w:val="28"/>
-        </w:rPr>
-        <w:lastRenderedPageBreak/>
-        <w:t xml:space="preserve">due to simulation constraints my design did not work, so I used a predesigned BCD decoder from web. </w:t>
+        <w:t xml:space="preserve">To display time as output we need to convert counted binary digits into decimal number for which I used BCD decoder which converts binary coded decimal values back to decimal. I tried to design BCD decoder using Verilog program but due to simulation constraints my design did not work, so I used a predesigned BCD decoder from web. </w:t>
       </w:r>
     </w:p>
     <w:p>
@@ -1894,6 +1932,29 @@
       </w:tblBorders>
     </w:tblPr>
   </w:style>
+  <w:style w:type="character" w:styleId="Hyperlink">
+    <w:name w:val="Hyperlink"/>
+    <w:basedOn w:val="DefaultParagraphFont"/>
+    <w:uiPriority w:val="99"/>
+    <w:unhideWhenUsed/>
+    <w:rsid w:val="00755EB3"/>
+    <w:rPr>
+      <w:color w:val="0563C1" w:themeColor="hyperlink"/>
+      <w:u w:val="single"/>
+    </w:rPr>
+  </w:style>
+  <w:style w:type="character" w:styleId="UnresolvedMention">
+    <w:name w:val="Unresolved Mention"/>
+    <w:basedOn w:val="DefaultParagraphFont"/>
+    <w:uiPriority w:val="99"/>
+    <w:semiHidden/>
+    <w:unhideWhenUsed/>
+    <w:rsid w:val="00755EB3"/>
+    <w:rPr>
+      <w:color w:val="605E5C"/>
+      <w:shd w:val="clear" w:color="auto" w:fill="E1DFDD"/>
+    </w:rPr>
+  </w:style>
 </w:styles>
 </file>
 

</xml_diff>